<commit_message>
Add targeter and contextologist roles to team section
</commit_message>
<xml_diff>
--- a/eco-dvor-launch-map.docx
+++ b/eco-dvor-launch-map.docx
@@ -2153,6 +2153,70 @@
       </w:tr>
       <w:tr>
         <w:tc>
+          <w:p>
+            <w:r>
+              <w:rPr>
+                <w:sz w:val="18"/>
+              </w:rPr>
+              <w:t>Таргетолог (рекламный менеджер)</w:t>
+            </w:r>
+          </w:p>
+        </w:tc>
+        <w:tc>
+          <w:p>
+            <w:r>
+              <w:rPr>
+                <w:sz w:val="18"/>
+              </w:rPr>
+              <w:t>Штат или фриланс</w:t>
+            </w:r>
+          </w:p>
+        </w:tc>
+        <w:tc>
+          <w:p>
+            <w:r>
+              <w:rPr>
+                <w:sz w:val="18"/>
+              </w:rPr>
+              <w:t>60–100 тр</w:t>
+            </w:r>
+          </w:p>
+        </w:tc>
+      </w:tr>
+      <w:tr>
+        <w:tc>
+          <w:p>
+            <w:r>
+              <w:rPr>
+                <w:sz w:val="18"/>
+              </w:rPr>
+              <w:t>Контекстолог</w:t>
+            </w:r>
+          </w:p>
+        </w:tc>
+        <w:tc>
+          <w:p>
+            <w:r>
+              <w:rPr>
+                <w:sz w:val="18"/>
+              </w:rPr>
+              <w:t>Штат или фриланс</w:t>
+            </w:r>
+          </w:p>
+        </w:tc>
+        <w:tc>
+          <w:p>
+            <w:r>
+              <w:rPr>
+                <w:sz w:val="18"/>
+              </w:rPr>
+              <w:t>50–80 тр</w:t>
+            </w:r>
+          </w:p>
+        </w:tc>
+      </w:tr>
+      <w:tr>
+        <w:tc>
           <w:tcPr>
             <w:tcW w:type="dxa" w:w="3135"/>
           </w:tcPr>
@@ -2225,9 +2289,10 @@
           <w:p>
             <w:r>
               <w:rPr>
+                <w:b/>
                 <w:sz w:val="18"/>
               </w:rPr>
-              <w:t>240–400 тр/мес</w:t>
+              <w:t>350–580 тр/мес</w:t>
             </w:r>
           </w:p>
         </w:tc>
@@ -2772,6 +2837,249 @@
         <w:t>Монтаж самостоятельный, с субтитрами, в едином визуальном стиле</w:t>
       </w:r>
     </w:p>
+    <w:p>
+      <w:r>
+        <w:t/>
+      </w:r>
+    </w:p>
+    <w:p>
+      <w:r>
+        <w:rPr>
+          <w:b/>
+          <w:sz w:val="26"/>
+          <w:color w:val="2D7A47"/>
+        </w:rPr>
+        <w:t>Таргетолог (рекламный менеджер) — платный трафик в соцсетях</w:t>
+      </w:r>
+    </w:p>
+    <w:p>
+      <w:pPr>
+        <w:spacing w:after="60"/>
+      </w:pPr>
+      <w:r>
+        <w:rPr>
+          <w:b/>
+          <w:sz w:val="20"/>
+        </w:rPr>
+        <w:t>Зона ответственности: </w:t>
+      </w:r>
+      <w:r>
+        <w:rPr>
+          <w:sz w:val="20"/>
+        </w:rPr>
+        <w:t>всё, что связано с платной рекламой во ВКонтакте и других социальных сетях.</w:t>
+      </w:r>
+    </w:p>
+    <w:p>
+      <w:pPr>
+        <w:spacing w:after="60"/>
+      </w:pPr>
+      <w:r>
+        <w:rPr>
+          <w:b/>
+          <w:sz w:val="20"/>
+        </w:rPr>
+        <w:t>Настройка и ведение: </w:t>
+      </w:r>
+      <w:r>
+        <w:rPr>
+          <w:sz w:val="20"/>
+        </w:rPr>
+        <w:t>Создаёт и ведёт рекламные кампании в VK Рекламе. Формирует аудитории по интересам, географии, поведению, базам (look-alike). Тестирует форматы: видео, карусель, лид-форма, трафик на сайт. Пишет тексты объявлений совместно с SMM.</w:t>
+      </w:r>
+    </w:p>
+    <w:p>
+      <w:pPr>
+        <w:spacing w:after="60"/>
+      </w:pPr>
+      <w:r>
+        <w:rPr>
+          <w:b/>
+          <w:sz w:val="20"/>
+        </w:rPr>
+        <w:t>Аналитика и оптимизация: </w:t>
+      </w:r>
+      <w:r>
+        <w:rPr>
+          <w:sz w:val="20"/>
+        </w:rPr>
+        <w:t>Ежедневно мониторит CTR, CPL (стоимость заявки), CR (конверсия в запись). Выключает неработающие объявления, масштабирует эффективные связки. Еженедельно сдаёт отчёт продюсеру.</w:t>
+      </w:r>
+    </w:p>
+    <w:p>
+      <w:pPr>
+        <w:spacing w:after="60"/>
+      </w:pPr>
+      <w:r>
+        <w:rPr>
+          <w:b/>
+          <w:sz w:val="20"/>
+        </w:rPr>
+        <w:t>Тестирование: </w:t>
+      </w:r>
+      <w:r>
+        <w:rPr>
+          <w:sz w:val="20"/>
+        </w:rPr>
+        <w:t>Ведёт журнал гипотез. Не менее 3–5 новых тестов в месяц по аудиториям и креативам.</w:t>
+      </w:r>
+    </w:p>
+    <w:p>
+      <w:pPr>
+        <w:spacing w:after="60"/>
+      </w:pPr>
+      <w:r>
+        <w:rPr>
+          <w:b/>
+          <w:sz w:val="20"/>
+        </w:rPr>
+        <w:t>Взаимодействие с командой: </w:t>
+      </w:r>
+      <w:r>
+        <w:rPr>
+          <w:sz w:val="20"/>
+        </w:rPr>
+        <w:t>Получает задачи и бюджет от продюсера. Запрашивает у видеографа нужные форматы под рекламу. Передаёт в CRM данные о входящих заявках из лид-форм.</w:t>
+      </w:r>
+    </w:p>
+    <w:p>
+      <w:pPr>
+        <w:spacing w:after="60"/>
+      </w:pPr>
+      <w:r>
+        <w:rPr>
+          <w:b/>
+          <w:sz w:val="20"/>
+        </w:rPr>
+        <w:t>Что НЕ делает: </w:t>
+      </w:r>
+      <w:r>
+        <w:rPr>
+          <w:sz w:val="20"/>
+        </w:rPr>
+        <w:t>не занимается Яндекс.Директ (это зона контекстолога), не ведёт соцсети органически.</w:t>
+      </w:r>
+    </w:p>
+    <w:p/>
+    <w:p>
+      <w:r>
+        <w:rPr>
+          <w:b/>
+          <w:sz w:val="26"/>
+          <w:color w:val="2D7A47"/>
+        </w:rPr>
+        <w:t>Контекстолог — платный трафик в Яндексе</w:t>
+      </w:r>
+    </w:p>
+    <w:p>
+      <w:pPr>
+        <w:spacing w:after="60"/>
+      </w:pPr>
+      <w:r>
+        <w:rPr>
+          <w:b/>
+          <w:sz w:val="20"/>
+        </w:rPr>
+        <w:t>Зона ответственности: </w:t>
+      </w:r>
+      <w:r>
+        <w:rPr>
+          <w:sz w:val="20"/>
+        </w:rPr>
+        <w:t>реклама в Яндекс.Директ (поиск + РСЯ) и продвижение на картах (Яндекс.Карты, 2GIS).</w:t>
+      </w:r>
+    </w:p>
+    <w:p>
+      <w:pPr>
+        <w:spacing w:after="60"/>
+      </w:pPr>
+      <w:r>
+        <w:rPr>
+          <w:b/>
+          <w:sz w:val="20"/>
+        </w:rPr>
+        <w:t>Настройка и ведение: </w:t>
+      </w:r>
+      <w:r>
+        <w:rPr>
+          <w:sz w:val="20"/>
+        </w:rPr>
+        <w:t>Собирает семантическое ядро: целевые запросы ("детский досуг Москва", "куда с детьми", "контактный зоопарк Москва") и минус-слова. Настраивает поисковые кампании и РСЯ. Пишет объявления под каждую группу запросов.</w:t>
+      </w:r>
+    </w:p>
+    <w:p>
+      <w:pPr>
+        <w:spacing w:after="60"/>
+      </w:pPr>
+      <w:r>
+        <w:rPr>
+          <w:b/>
+          <w:sz w:val="20"/>
+        </w:rPr>
+        <w:t>Карты и геосервисы: </w:t>
+      </w:r>
+      <w:r>
+        <w:rPr>
+          <w:sz w:val="20"/>
+        </w:rPr>
+        <w:t>Настраивает платное продвижение карточки Эко-двора в Яндекс.Картах и 2GIS. Следит за рейтингом, заполненностью карточки, наличием фото. Стимулирует сбор отзывов для улучшения позиций в выдаче.</w:t>
+      </w:r>
+    </w:p>
+    <w:p>
+      <w:pPr>
+        <w:spacing w:after="60"/>
+      </w:pPr>
+      <w:r>
+        <w:rPr>
+          <w:b/>
+          <w:sz w:val="20"/>
+        </w:rPr>
+        <w:t>Аналитика: </w:t>
+      </w:r>
+      <w:r>
+        <w:rPr>
+          <w:sz w:val="20"/>
+        </w:rPr>
+        <w:t>Настраивает цели в Яндекс.Метрике (заявка, звонок, переход в мессенджер). Еженедельно анализирует стоимость клика, стоимость заявки, конверсию по каждой кампании.</w:t>
+      </w:r>
+    </w:p>
+    <w:p>
+      <w:pPr>
+        <w:spacing w:after="60"/>
+      </w:pPr>
+      <w:r>
+        <w:rPr>
+          <w:b/>
+          <w:sz w:val="20"/>
+        </w:rPr>
+        <w:t>Оптимизация: </w:t>
+      </w:r>
+      <w:r>
+        <w:rPr>
+          <w:sz w:val="20"/>
+        </w:rPr>
+        <w:t>Регулярно чистит поисковые запросы (минус-слова), тестирует новые объявления, корректирует ставки по времени суток и устройствам.</w:t>
+      </w:r>
+    </w:p>
+    <w:p>
+      <w:pPr>
+        <w:spacing w:after="60"/>
+      </w:pPr>
+      <w:r>
+        <w:rPr>
+          <w:b/>
+          <w:sz w:val="20"/>
+        </w:rPr>
+        <w:t>Что НЕ делает: </w:t>
+      </w:r>
+      <w:r>
+        <w:rPr>
+          <w:sz w:val="20"/>
+        </w:rPr>
+        <w:t>не занимается рекламой в VK (это зона таргетолога), не ведёт органический контент.</w:t>
+      </w:r>
+    </w:p>
+    <w:p/>
     <w:p>
       <w:pPr>
         <w:pStyle w:val="Heading2"/>

</xml_diff>